<commit_message>
Localize renderers (--lang=en) and English figure set
- tools/i18n.py: label dictionary + SVG text-node localizer; render_svg /
  render_dial / render_front / symboly.py gain a --lang=en switch (Czech is the
  default and unchanged; symboly localizes at source via the built-in en field).
- Generated an English-labelled figure set (render/*-en.svg).
- spec/specification.en.md now embeds the English figures and drops the
  "labels are in Czech" note; spec/specification.en.docx rebuilt with them.
- CHANGELOG updated.

Co-Authored-By: Claude Opus 4.8 <noreply@anthropic.com>
</commit_message>
<xml_diff>
--- a/spec/specification.en.docx
+++ b/spec/specification.en.docx
@@ -2778,7 +2778,7 @@
               <a:graphicData uri="http://schemas.openxmlformats.org/drawingml/2006/picture">
                 <pic:pic>
                   <pic:nvPicPr>
-                    <pic:cNvPr descr="/tmp/hbuild/vezni-jici-bici.png" id="18" name="Picture"/>
+                    <pic:cNvPr descr="/tmp/hbuild/vezni-jici-bici-en.png" id="18" name="Picture"/>
                     <pic:cNvPicPr>
                       <a:picLocks noChangeArrowheads="1" noChangeAspect="1"/>
                     </pic:cNvPicPr>
@@ -2824,18 +2824,6 @@
         <w:pStyle w:val="BodyText"/>
       </w:pPr>
       <w:r>
-        <w:rPr>
-          <w:i/>
-          <w:iCs/>
-        </w:rPr>
-        <w:t xml:space="preserve">Figure labels are in Czech (renderer localisation is planned).</w:t>
-      </w:r>
-    </w:p>
-    <w:p>
-      <w:pPr>
-        <w:pStyle w:val="BodyText"/>
-      </w:pPr>
-      <w:r>
         <w:t xml:space="preserve">On the left the red</w:t>
       </w:r>
       <w:r>
@@ -3039,7 +3027,7 @@
               <a:graphicData uri="http://schemas.openxmlformats.org/drawingml/2006/picture">
                 <pic:pic>
                   <pic:nvPicPr>
-                    <pic:cNvPr descr="/tmp/hbuild/italske-vezni-cifernik.png" id="22" name="Picture"/>
+                    <pic:cNvPr descr="/tmp/hbuild/italske-vezni-cifernik-en.png" id="22" name="Picture"/>
                     <pic:cNvPicPr>
                       <a:picLocks noChangeArrowheads="1" noChangeAspect="1"/>
                     </pic:cNvPicPr>
@@ -3633,7 +3621,7 @@
               <a:graphicData uri="http://schemas.openxmlformats.org/drawingml/2006/picture">
                 <pic:pic>
                   <pic:nvPicPr>
-                    <pic:cNvPr descr="/tmp/hbuild/vezni-jici-bici-front.png" id="26" name="Picture"/>
+                    <pic:cNvPr descr="/tmp/hbuild/vezni-jici-bici-front-en.png" id="26" name="Picture"/>
                     <pic:cNvPicPr>
                       <a:picLocks noChangeArrowheads="1" noChangeAspect="1"/>
                     </pic:cNvPicPr>
@@ -13970,7 +13958,7 @@
               <a:graphicData uri="http://schemas.openxmlformats.org/drawingml/2006/picture">
                 <pic:pic>
                   <pic:nvPicPr>
-                    <pic:cNvPr descr="/tmp/hbuild/symboly.png" id="38" name="Picture"/>
+                    <pic:cNvPr descr="/tmp/hbuild/symboly-en.png" id="38" name="Picture"/>
                     <pic:cNvPicPr>
                       <a:picLocks noChangeArrowheads="1" noChangeAspect="1"/>
                     </pic:cNvPicPr>
@@ -14016,18 +14004,6 @@
         <w:pStyle w:val="BodyText"/>
       </w:pPr>
       <w:r>
-        <w:rPr>
-          <w:i/>
-          <w:iCs/>
-        </w:rPr>
-        <w:t xml:space="preserve">Figure labels are in Czech (renderer localisation is planned).</w:t>
-      </w:r>
-    </w:p>
-    <w:p>
-      <w:pPr>
-        <w:pStyle w:val="BodyText"/>
-      </w:pPr>
-      <w:r>
         <w:t xml:space="preserve">In the diagrams the escapement is</w:t>
       </w:r>
       <w:r>
@@ -14360,7 +14336,7 @@
               <a:graphicData uri="http://schemas.openxmlformats.org/drawingml/2006/picture">
                 <pic:pic>
                   <pic:nvPicPr>
-                    <pic:cNvPr descr="/tmp/hbuild/praga-orloj.png" id="42" name="Picture"/>
+                    <pic:cNvPr descr="/tmp/hbuild/praga-orloj-en.png" id="42" name="Picture"/>
                     <pic:cNvPicPr>
                       <a:picLocks noChangeArrowheads="1" noChangeAspect="1"/>
                     </pic:cNvPicPr>

</xml_diff>